<commit_message>
docs: alinea el plan a MySQL (descarta PostgreSQL)
</commit_message>
<xml_diff>
--- a/docs/Krypton_Caso_de_Negocio.docx
+++ b/docs/Krypton_Caso_de_Negocio.docx
@@ -956,7 +956,7 @@
                 <w:sz w:val="21"/>
                 <w:lang w:val="es-419"/>
               </w:rPr>
-              <w:t>Base de datos relacional PostgreSQL en la nube, con modelo normalizado (User, Product, Category, Order, OrderItem).</w:t>
+              <w:t>Base de datos relacional MySQL 8 en la nube, con modelo normalizado (User, Product, Category, Order, OrderItem).</w:t>
             </w:r>
           </w:p>
         </w:tc>
@@ -1351,14 +1351,14 @@
                 <w:sz w:val="21"/>
                 <w:lang w:val="es-419"/>
               </w:rPr>
-              <w:t>PostgreSQL (en la nube: Supabase</w:t>
+              <w:t>MySQL 8 (en la nube: Railway</w:t>
             </w:r>
             <w:r>
               <w:rPr>
                 <w:sz w:val="21"/>
                 <w:lang w:val="es-419"/>
               </w:rPr>
-              <w:t xml:space="preserve"> / Neon) + Flyway</w:t>
+              <w:t xml:space="preserve"> / Aiven) + Flyway</w:t>
             </w:r>
           </w:p>
         </w:tc>

</xml_diff>